<commit_message>
replace placeholder name  with Customer across the application
</commit_message>
<xml_diff>
--- a/report/Villis_Cafe_Final_Report.docx
+++ b/report/Villis_Cafe_Final_Report.docx
@@ -59,9 +59,7 @@
             </w:tcMar>
           </w:tcPr>
           <w:p>
-            <w:r>
-              <w:t>Samsudeen Ashad — VERIFY BEFORE SUBMISSION</w:t>
-            </w:r>
+            <w:r/>
           </w:p>
         </w:tc>
       </w:tr>
@@ -342,7 +340,7 @@
         <w:br/>
       </w:r>
       <w:r>
-        <w:t>Repository evidence identified Samsudeen Ashad as the contributor. Add any other formally associated participants here before submission: [ENTER NAMES OR STATE ‘UNDERTAKEN ALONE’].</w:t>
+        <w:t>[ENTER PARTICIPANT NAMES OR STATE ‘UNDERTAKEN ALONE’].</w:t>
       </w:r>
     </w:p>
     <w:p>
@@ -474,7 +472,7 @@
         <w:jc w:val="center"/>
       </w:pPr>
       <w:r>
-        <w:t>Prepared by: Samsudeen Ashad (verify)</w:t>
+        <w:t>Prepared by: ______________________________</w:t>
         <w:br/>
       </w:r>
       <w:r>
@@ -3927,7 +3925,7 @@
     </w:p>
     <w:p>
       <w:r>
-        <w:t>The repository contained 23 commits attributed to Samsudeen Ashad through two equivalent Git identities. The history covered the project scaffold, core architecture, product discovery, cart, checkout, confirmation, promotions, profile, loyalty, authentication, administrator controls, chat, notifications, dark mode, Android configuration, testing, resilience, documentation, and the final Villi’s Cafe rebrand. On the evidence available in the repository, this represented the individual contribution to the submitted product.</w:t>
+        <w:t>The repository contained 23 commits attributed to one contributor through two equivalent Git identities. The history covered the project scaffold, core architecture, product discovery, cart, checkout, confirmation, promotions, profile, loyalty, authentication, administrator controls, chat, notifications, dark mode, Android configuration, testing, resilience, documentation, and the final Villi’s Cafe rebrand. The contributor name was intentionally left blank and must be completed accurately before submission.</w:t>
       </w:r>
     </w:p>
     <w:tbl>
@@ -4079,7 +4077,6 @@
               <w:rPr>
                 <w:sz w:val="17"/>
               </w:rPr>
-              <w:t>Samsudeen Ashad</w:t>
             </w:r>
           </w:p>
         </w:tc>
@@ -4153,15 +4150,9 @@
         </w:rPr>
         <w:t xml:space="preserve">GitHub repository: </w:t>
       </w:r>
-      <w:hyperlink r:id="rId22">
-        <w:r>
-          <w:rPr>
-            <w:color w:val="C63D0A"/>
-            <w:u w:val="single"/>
-          </w:rPr>
-          <w:t>https://github.com/SamsudeenAshad/QuickBite-Cafe</w:t>
-        </w:r>
-      </w:hyperlink>
+      <w:r>
+        <w:t>[PASTE GITHUB REPOSITORY LINK]</w:t>
+      </w:r>
     </w:p>
     <w:p>
       <w:r>
@@ -4234,7 +4225,7 @@
       <w:r>
         <w:t xml:space="preserve">Flutter (2026) Material Design for Flutter. Available at: </w:t>
       </w:r>
-      <w:hyperlink r:id="rId23">
+      <w:hyperlink r:id="rId22">
         <w:r>
           <w:rPr>
             <w:color w:val="C63D0A"/>
@@ -4254,7 +4245,7 @@
       <w:r>
         <w:t xml:space="preserve">Flutter (2026) General approach to adaptive apps. Available at: </w:t>
       </w:r>
-      <w:hyperlink r:id="rId24">
+      <w:hyperlink r:id="rId23">
         <w:r>
           <w:rPr>
             <w:color w:val="C63D0A"/>
@@ -4274,7 +4265,7 @@
       <w:r>
         <w:t xml:space="preserve">Remi Rousselet and contributors (2025) provider 6.1.5+1. Available at: </w:t>
       </w:r>
-      <w:hyperlink r:id="rId25">
+      <w:hyperlink r:id="rId24">
         <w:r>
           <w:rPr>
             <w:color w:val="C63D0A"/>
@@ -4294,7 +4285,7 @@
       <w:r>
         <w:t xml:space="preserve">Tekartik (2026) sqflite: SQLite plugin for Flutter. Available at: </w:t>
       </w:r>
-      <w:hyperlink r:id="rId26">
+      <w:hyperlink r:id="rId25">
         <w:r>
           <w:rPr>
             <w:color w:val="C63D0A"/>
@@ -4314,7 +4305,7 @@
       <w:r>
         <w:t xml:space="preserve">SQLite Project (2026) Transaction. Available at: </w:t>
       </w:r>
-      <w:hyperlink r:id="rId27">
+      <w:hyperlink r:id="rId26">
         <w:r>
           <w:rPr>
             <w:color w:val="C63D0A"/>
@@ -4334,15 +4325,9 @@
       <w:r>
         <w:t xml:space="preserve">Villi’s Cafe project repository (2026) QuickBite-Cafe source code and README. Available at: </w:t>
       </w:r>
-      <w:hyperlink r:id="rId22">
-        <w:r>
-          <w:rPr>
-            <w:color w:val="C63D0A"/>
-            <w:u w:val="single"/>
-          </w:rPr>
-          <w:t>https://github.com/SamsudeenAshad/QuickBite-Cafe</w:t>
-        </w:r>
-      </w:hyperlink>
+      <w:r>
+        <w:t>[PASTE GITHUB REPOSITORY LINK]</w:t>
+      </w:r>
       <w:r>
         <w:t xml:space="preserve"> (Accessed: 25 August 2026).</w:t>
       </w:r>

</xml_diff>